<commit_message>
Add Tkinter emotion detection interface with dynamic backend selection
</commit_message>
<xml_diff>
--- a/docs/Análisis Comparativo de Detectores Faciales.docx
+++ b/docs/Análisis Comparativo de Detectores Faciales.docx
@@ -2925,7 +2925,9 @@
       <w:r>
         <w:t xml:space="preserve"> (Equipo 1)</w:t>
       </w:r>
+      <w:bookmarkStart w:id="14" w:name="_GoBack"/>
       <w:bookmarkEnd w:id="13"/>
+      <w:bookmarkEnd w:id="14"/>
     </w:p>
     <w:tbl>
       <w:tblPr>
@@ -3466,6 +3468,7 @@
         <w:rPr>
           <w:rFonts w:asciiTheme="minorHAnsi" w:eastAsia="Times New Roman" w:hAnsiTheme="minorHAnsi" w:cstheme="minorHAnsi"/>
           <w:sz w:val="22"/>
+          <w:lang w:val="en-US"/>
         </w:rPr>
       </w:pPr>
       <w:r>
@@ -3475,8 +3478,6 @@
         </w:rPr>
         <w:t>Nota: Los valores registrados corresponden a promedios aproximados obtenidos durante pruebas en tiempo real bajo condiciones controladas.</w:t>
       </w:r>
-      <w:bookmarkStart w:id="14" w:name="_GoBack"/>
-      <w:bookmarkEnd w:id="14"/>
     </w:p>
     <w:p>
       <w:pPr>
@@ -3800,7 +3801,6 @@
         <w:docPartUnique/>
       </w:docPartObj>
     </w:sdtPr>
-    <w:sdtEndPr/>
     <w:sdtContent>
       <w:p>
         <w:pPr>
@@ -3821,7 +3821,7 @@
             <w:noProof/>
             <w:lang w:val="es-ES"/>
           </w:rPr>
-          <w:t>6</w:t>
+          <w:t>2</w:t>
         </w:r>
         <w:r>
           <w:fldChar w:fldCharType="end"/>
@@ -9620,7 +9620,7 @@
 </file>
 
 <file path=customXml/itemProps1.xml><?xml version="1.0" encoding="utf-8"?>
-<ds:datastoreItem xmlns:ds="http://schemas.openxmlformats.org/officeDocument/2006/customXml" ds:itemID="{89B4A7EA-6620-4830-B669-6DEBEC506B80}">
+<ds:datastoreItem xmlns:ds="http://schemas.openxmlformats.org/officeDocument/2006/customXml" ds:itemID="{C22FE8E1-685E-434E-9FF0-467176B0FE49}">
   <ds:schemaRefs>
     <ds:schemaRef ds:uri="http://schemas.openxmlformats.org/officeDocument/2006/bibliography"/>
   </ds:schemaRefs>

</xml_diff>

<commit_message>
Update documentation with additional hardware benchmark results
</commit_message>
<xml_diff>
--- a/docs/Análisis Comparativo de Detectores Faciales.docx
+++ b/docs/Análisis Comparativo de Detectores Faciales.docx
@@ -450,10 +450,12 @@
         <w:p>
           <w:pPr>
             <w:pStyle w:val="TtulodeTDC"/>
+            <w:spacing w:line="240" w:lineRule="auto"/>
             <w:jc w:val="center"/>
             <w:rPr>
               <w:b/>
               <w:color w:val="000000" w:themeColor="text1"/>
+              <w:lang w:val="es-ES"/>
             </w:rPr>
           </w:pPr>
           <w:r>
@@ -464,6 +466,13 @@
             </w:rPr>
             <w:t>Índice</w:t>
           </w:r>
+        </w:p>
+        <w:p>
+          <w:pPr>
+            <w:rPr>
+              <w:lang w:val="es-ES" w:eastAsia="ja-JP"/>
+            </w:rPr>
+          </w:pPr>
         </w:p>
         <w:p>
           <w:pPr>
@@ -488,7 +497,7 @@
               <w:b w:val="0"/>
               <w:bCs w:val="0"/>
               <w:caps w:val="0"/>
-              <w:sz w:val="44"/>
+              <w:sz w:val="52"/>
             </w:rPr>
             <w:fldChar w:fldCharType="begin"/>
           </w:r>
@@ -497,7 +506,7 @@
               <w:b w:val="0"/>
               <w:bCs w:val="0"/>
               <w:caps w:val="0"/>
-              <w:sz w:val="44"/>
+              <w:sz w:val="52"/>
             </w:rPr>
             <w:instrText xml:space="preserve"> TOC \o "1-3" \h \z \u </w:instrText>
           </w:r>
@@ -506,11 +515,11 @@
               <w:b w:val="0"/>
               <w:bCs w:val="0"/>
               <w:caps w:val="0"/>
-              <w:sz w:val="44"/>
+              <w:sz w:val="52"/>
             </w:rPr>
             <w:fldChar w:fldCharType="separate"/>
           </w:r>
-          <w:hyperlink w:anchor="_Toc230025458" w:history="1">
+          <w:hyperlink w:anchor="_Toc230080749" w:history="1">
             <w:r>
               <w:rPr>
                 <w:rStyle w:val="Hipervnculo"/>
@@ -541,7 +550,7 @@
                 <w:webHidden/>
                 <w:sz w:val="24"/>
               </w:rPr>
-              <w:instrText xml:space="preserve"> PAGEREF _Toc230025458 \h </w:instrText>
+              <w:instrText xml:space="preserve"> PAGEREF _Toc230080749 \h </w:instrText>
             </w:r>
             <w:r>
               <w:rPr>
@@ -564,7 +573,7 @@
                 <w:webHidden/>
                 <w:sz w:val="24"/>
               </w:rPr>
-              <w:t>3</w:t>
+              <w:t>4</w:t>
             </w:r>
             <w:r>
               <w:rPr>
@@ -593,7 +602,7 @@
               <w:lang w:eastAsia="ja-JP"/>
             </w:rPr>
           </w:pPr>
-          <w:hyperlink w:anchor="_Toc230025459" w:history="1">
+          <w:hyperlink w:anchor="_Toc230080750" w:history="1">
             <w:r>
               <w:rPr>
                 <w:rStyle w:val="Hipervnculo"/>
@@ -624,7 +633,7 @@
                 <w:webHidden/>
                 <w:sz w:val="24"/>
               </w:rPr>
-              <w:instrText xml:space="preserve"> PAGEREF _Toc230025459 \h </w:instrText>
+              <w:instrText xml:space="preserve"> PAGEREF _Toc230080750 \h </w:instrText>
             </w:r>
             <w:r>
               <w:rPr>
@@ -647,7 +656,7 @@
                 <w:webHidden/>
                 <w:sz w:val="24"/>
               </w:rPr>
-              <w:t>3</w:t>
+              <w:t>4</w:t>
             </w:r>
             <w:r>
               <w:rPr>
@@ -676,7 +685,7 @@
               <w:lang w:eastAsia="ja-JP"/>
             </w:rPr>
           </w:pPr>
-          <w:hyperlink w:anchor="_Toc230025460" w:history="1">
+          <w:hyperlink w:anchor="_Toc230080751" w:history="1">
             <w:r>
               <w:rPr>
                 <w:rStyle w:val="Hipervnculo"/>
@@ -707,7 +716,7 @@
                 <w:webHidden/>
                 <w:sz w:val="24"/>
               </w:rPr>
-              <w:instrText xml:space="preserve"> PAGEREF _Toc230025460 \h </w:instrText>
+              <w:instrText xml:space="preserve"> PAGEREF _Toc230080751 \h </w:instrText>
             </w:r>
             <w:r>
               <w:rPr>
@@ -730,7 +739,7 @@
                 <w:webHidden/>
                 <w:sz w:val="24"/>
               </w:rPr>
-              <w:t>3</w:t>
+              <w:t>4</w:t>
             </w:r>
             <w:r>
               <w:rPr>
@@ -757,7 +766,7 @@
               <w:lang w:eastAsia="ja-JP"/>
             </w:rPr>
           </w:pPr>
-          <w:hyperlink w:anchor="_Toc230025461" w:history="1">
+          <w:hyperlink w:anchor="_Toc230080752" w:history="1">
             <w:r>
               <w:rPr>
                 <w:rStyle w:val="Hipervnculo"/>
@@ -788,7 +797,7 @@
                 <w:webHidden/>
                 <w:sz w:val="24"/>
               </w:rPr>
-              <w:instrText xml:space="preserve"> PAGEREF _Toc230025461 \h </w:instrText>
+              <w:instrText xml:space="preserve"> PAGEREF _Toc230080752 \h </w:instrText>
             </w:r>
             <w:r>
               <w:rPr>
@@ -811,7 +820,7 @@
                 <w:webHidden/>
                 <w:sz w:val="24"/>
               </w:rPr>
-              <w:t>3</w:t>
+              <w:t>4</w:t>
             </w:r>
             <w:r>
               <w:rPr>
@@ -838,7 +847,7 @@
               <w:lang w:eastAsia="ja-JP"/>
             </w:rPr>
           </w:pPr>
-          <w:hyperlink w:anchor="_Toc230025462" w:history="1">
+          <w:hyperlink w:anchor="_Toc230080753" w:history="1">
             <w:r>
               <w:rPr>
                 <w:rStyle w:val="Hipervnculo"/>
@@ -869,7 +878,7 @@
                 <w:webHidden/>
                 <w:sz w:val="24"/>
               </w:rPr>
-              <w:instrText xml:space="preserve"> PAGEREF _Toc230025462 \h </w:instrText>
+              <w:instrText xml:space="preserve"> PAGEREF _Toc230080753 \h </w:instrText>
             </w:r>
             <w:r>
               <w:rPr>
@@ -892,7 +901,7 @@
                 <w:webHidden/>
                 <w:sz w:val="24"/>
               </w:rPr>
-              <w:t>3</w:t>
+              <w:t>4</w:t>
             </w:r>
             <w:r>
               <w:rPr>
@@ -921,7 +930,7 @@
               <w:lang w:eastAsia="ja-JP"/>
             </w:rPr>
           </w:pPr>
-          <w:hyperlink w:anchor="_Toc230025463" w:history="1">
+          <w:hyperlink w:anchor="_Toc230080754" w:history="1">
             <w:r>
               <w:rPr>
                 <w:rStyle w:val="Hipervnculo"/>
@@ -952,7 +961,7 @@
                 <w:webHidden/>
                 <w:sz w:val="24"/>
               </w:rPr>
-              <w:instrText xml:space="preserve"> PAGEREF _Toc230025463 \h </w:instrText>
+              <w:instrText xml:space="preserve"> PAGEREF _Toc230080754 \h </w:instrText>
             </w:r>
             <w:r>
               <w:rPr>
@@ -975,7 +984,7 @@
                 <w:webHidden/>
                 <w:sz w:val="24"/>
               </w:rPr>
-              <w:t>4</w:t>
+              <w:t>5</w:t>
             </w:r>
             <w:r>
               <w:rPr>
@@ -1004,7 +1013,7 @@
               <w:lang w:eastAsia="ja-JP"/>
             </w:rPr>
           </w:pPr>
-          <w:hyperlink w:anchor="_Toc230025464" w:history="1">
+          <w:hyperlink w:anchor="_Toc230080755" w:history="1">
             <w:r>
               <w:rPr>
                 <w:rStyle w:val="Hipervnculo"/>
@@ -1035,7 +1044,7 @@
                 <w:webHidden/>
                 <w:sz w:val="24"/>
               </w:rPr>
-              <w:instrText xml:space="preserve"> PAGEREF _Toc230025464 \h </w:instrText>
+              <w:instrText xml:space="preserve"> PAGEREF _Toc230080755 \h </w:instrText>
             </w:r>
             <w:r>
               <w:rPr>
@@ -1058,7 +1067,7 @@
                 <w:webHidden/>
                 <w:sz w:val="24"/>
               </w:rPr>
-              <w:t>4</w:t>
+              <w:t>5</w:t>
             </w:r>
             <w:r>
               <w:rPr>
@@ -1085,7 +1094,7 @@
               <w:lang w:eastAsia="ja-JP"/>
             </w:rPr>
           </w:pPr>
-          <w:hyperlink w:anchor="_Toc230025465" w:history="1">
+          <w:hyperlink w:anchor="_Toc230080756" w:history="1">
             <w:r>
               <w:rPr>
                 <w:rStyle w:val="Hipervnculo"/>
@@ -1116,7 +1125,7 @@
                 <w:webHidden/>
                 <w:sz w:val="24"/>
               </w:rPr>
-              <w:instrText xml:space="preserve"> PAGEREF _Toc230025465 \h </w:instrText>
+              <w:instrText xml:space="preserve"> PAGEREF _Toc230080756 \h </w:instrText>
             </w:r>
             <w:r>
               <w:rPr>
@@ -1139,7 +1148,7 @@
                 <w:webHidden/>
                 <w:sz w:val="24"/>
               </w:rPr>
-              <w:t>4</w:t>
+              <w:t>5</w:t>
             </w:r>
             <w:r>
               <w:rPr>
@@ -1166,7 +1175,7 @@
               <w:lang w:eastAsia="ja-JP"/>
             </w:rPr>
           </w:pPr>
-          <w:hyperlink w:anchor="_Toc230025466" w:history="1">
+          <w:hyperlink w:anchor="_Toc230080757" w:history="1">
             <w:r>
               <w:rPr>
                 <w:rStyle w:val="Hipervnculo"/>
@@ -1197,7 +1206,7 @@
                 <w:webHidden/>
                 <w:sz w:val="24"/>
               </w:rPr>
-              <w:instrText xml:space="preserve"> PAGEREF _Toc230025466 \h </w:instrText>
+              <w:instrText xml:space="preserve"> PAGEREF _Toc230080757 \h </w:instrText>
             </w:r>
             <w:r>
               <w:rPr>
@@ -1220,7 +1229,7 @@
                 <w:webHidden/>
                 <w:sz w:val="24"/>
               </w:rPr>
-              <w:t>4</w:t>
+              <w:t>5</w:t>
             </w:r>
             <w:r>
               <w:rPr>
@@ -1247,7 +1256,7 @@
               <w:lang w:eastAsia="ja-JP"/>
             </w:rPr>
           </w:pPr>
-          <w:hyperlink w:anchor="_Toc230025467" w:history="1">
+          <w:hyperlink w:anchor="_Toc230080758" w:history="1">
             <w:r>
               <w:rPr>
                 <w:rStyle w:val="Hipervnculo"/>
@@ -1278,7 +1287,7 @@
                 <w:webHidden/>
                 <w:sz w:val="24"/>
               </w:rPr>
-              <w:instrText xml:space="preserve"> PAGEREF _Toc230025467 \h </w:instrText>
+              <w:instrText xml:space="preserve"> PAGEREF _Toc230080758 \h </w:instrText>
             </w:r>
             <w:r>
               <w:rPr>
@@ -1301,7 +1310,7 @@
                 <w:webHidden/>
                 <w:sz w:val="24"/>
               </w:rPr>
-              <w:t>4</w:t>
+              <w:t>5</w:t>
             </w:r>
             <w:r>
               <w:rPr>
@@ -1330,7 +1339,7 @@
               <w:lang w:eastAsia="ja-JP"/>
             </w:rPr>
           </w:pPr>
-          <w:hyperlink w:anchor="_Toc230025468" w:history="1">
+          <w:hyperlink w:anchor="_Toc230080759" w:history="1">
             <w:r>
               <w:rPr>
                 <w:rStyle w:val="Hipervnculo"/>
@@ -1361,7 +1370,7 @@
                 <w:webHidden/>
                 <w:sz w:val="24"/>
               </w:rPr>
-              <w:instrText xml:space="preserve"> PAGEREF _Toc230025468 \h </w:instrText>
+              <w:instrText xml:space="preserve"> PAGEREF _Toc230080759 \h </w:instrText>
             </w:r>
             <w:r>
               <w:rPr>
@@ -1384,7 +1393,7 @@
                 <w:webHidden/>
                 <w:sz w:val="24"/>
               </w:rPr>
-              <w:t>4</w:t>
+              <w:t>5</w:t>
             </w:r>
             <w:r>
               <w:rPr>
@@ -1413,7 +1422,7 @@
               <w:lang w:eastAsia="ja-JP"/>
             </w:rPr>
           </w:pPr>
-          <w:hyperlink w:anchor="_Toc230025469" w:history="1">
+          <w:hyperlink w:anchor="_Toc230080760" w:history="1">
             <w:r>
               <w:rPr>
                 <w:rStyle w:val="Hipervnculo"/>
@@ -1444,7 +1453,7 @@
                 <w:webHidden/>
                 <w:sz w:val="24"/>
               </w:rPr>
-              <w:instrText xml:space="preserve"> PAGEREF _Toc230025469 \h </w:instrText>
+              <w:instrText xml:space="preserve"> PAGEREF _Toc230080760 \h </w:instrText>
             </w:r>
             <w:r>
               <w:rPr>
@@ -1467,7 +1476,7 @@
                 <w:webHidden/>
                 <w:sz w:val="24"/>
               </w:rPr>
-              <w:t>5</w:t>
+              <w:t>6</w:t>
             </w:r>
             <w:r>
               <w:rPr>
@@ -1496,7 +1505,7 @@
               <w:lang w:eastAsia="ja-JP"/>
             </w:rPr>
           </w:pPr>
-          <w:hyperlink w:anchor="_Toc230025470" w:history="1">
+          <w:hyperlink w:anchor="_Toc230080761" w:history="1">
             <w:r>
               <w:rPr>
                 <w:rStyle w:val="Hipervnculo"/>
@@ -1527,7 +1536,7 @@
                 <w:webHidden/>
                 <w:sz w:val="24"/>
               </w:rPr>
-              <w:instrText xml:space="preserve"> PAGEREF _Toc230025470 \h </w:instrText>
+              <w:instrText xml:space="preserve"> PAGEREF _Toc230080761 \h </w:instrText>
             </w:r>
             <w:r>
               <w:rPr>
@@ -1550,7 +1559,7 @@
                 <w:webHidden/>
                 <w:sz w:val="24"/>
               </w:rPr>
-              <w:t>5</w:t>
+              <w:t>6</w:t>
             </w:r>
             <w:r>
               <w:rPr>
@@ -1579,7 +1588,7 @@
               <w:lang w:eastAsia="ja-JP"/>
             </w:rPr>
           </w:pPr>
-          <w:hyperlink w:anchor="_Toc230025471" w:history="1">
+          <w:hyperlink w:anchor="_Toc230080762" w:history="1">
             <w:r>
               <w:rPr>
                 <w:rStyle w:val="Hipervnculo"/>
@@ -1610,7 +1619,7 @@
                 <w:webHidden/>
                 <w:sz w:val="24"/>
               </w:rPr>
-              <w:instrText xml:space="preserve"> PAGEREF _Toc230025471 \h </w:instrText>
+              <w:instrText xml:space="preserve"> PAGEREF _Toc230080762 \h </w:instrText>
             </w:r>
             <w:r>
               <w:rPr>
@@ -1633,7 +1642,7 @@
                 <w:webHidden/>
                 <w:sz w:val="24"/>
               </w:rPr>
-              <w:t>5</w:t>
+              <w:t>6</w:t>
             </w:r>
             <w:r>
               <w:rPr>
@@ -1662,14 +1671,14 @@
               <w:lang w:eastAsia="ja-JP"/>
             </w:rPr>
           </w:pPr>
-          <w:hyperlink w:anchor="_Toc230025472" w:history="1">
+          <w:hyperlink w:anchor="_Toc230080763" w:history="1">
             <w:r>
               <w:rPr>
                 <w:rStyle w:val="Hipervnculo"/>
                 <w:noProof/>
                 <w:sz w:val="24"/>
               </w:rPr>
-              <w:t>Observaciones</w:t>
+              <w:t>Observaciones (Equipo 1)</w:t>
             </w:r>
             <w:r>
               <w:rPr>
@@ -1693,7 +1702,7 @@
                 <w:webHidden/>
                 <w:sz w:val="24"/>
               </w:rPr>
-              <w:instrText xml:space="preserve"> PAGEREF _Toc230025472 \h </w:instrText>
+              <w:instrText xml:space="preserve"> PAGEREF _Toc230080763 \h </w:instrText>
             </w:r>
             <w:r>
               <w:rPr>
@@ -1716,7 +1725,7 @@
                 <w:webHidden/>
                 <w:sz w:val="24"/>
               </w:rPr>
-              <w:t>6</w:t>
+              <w:t>7</w:t>
             </w:r>
             <w:r>
               <w:rPr>
@@ -1745,14 +1754,14 @@
               <w:lang w:eastAsia="ja-JP"/>
             </w:rPr>
           </w:pPr>
-          <w:hyperlink w:anchor="_Toc230025473" w:history="1">
+          <w:hyperlink w:anchor="_Toc230080764" w:history="1">
             <w:r>
               <w:rPr>
                 <w:rStyle w:val="Hipervnculo"/>
                 <w:noProof/>
                 <w:sz w:val="24"/>
               </w:rPr>
-              <w:t>Conclusión</w:t>
+              <w:t>Hardware Utilizado Durante las Pruebas (Equipo 2)</w:t>
             </w:r>
             <w:r>
               <w:rPr>
@@ -1776,7 +1785,7 @@
                 <w:webHidden/>
                 <w:sz w:val="24"/>
               </w:rPr>
-              <w:instrText xml:space="preserve"> PAGEREF _Toc230025473 \h </w:instrText>
+              <w:instrText xml:space="preserve"> PAGEREF _Toc230080764 \h </w:instrText>
             </w:r>
             <w:r>
               <w:rPr>
@@ -1799,7 +1808,7 @@
                 <w:webHidden/>
                 <w:sz w:val="24"/>
               </w:rPr>
-              <w:t>6</w:t>
+              <w:t>7</w:t>
             </w:r>
             <w:r>
               <w:rPr>
@@ -1828,14 +1837,14 @@
               <w:lang w:eastAsia="ja-JP"/>
             </w:rPr>
           </w:pPr>
-          <w:hyperlink w:anchor="_Toc230025474" w:history="1">
+          <w:hyperlink w:anchor="_Toc230080765" w:history="1">
             <w:r>
               <w:rPr>
                 <w:rStyle w:val="Hipervnculo"/>
                 <w:noProof/>
                 <w:sz w:val="24"/>
               </w:rPr>
-              <w:t>Trabajo Futuro</w:t>
+              <w:t>Resultados Obtenidos (Equipo 2)</w:t>
             </w:r>
             <w:r>
               <w:rPr>
@@ -1859,7 +1868,7 @@
                 <w:webHidden/>
                 <w:sz w:val="24"/>
               </w:rPr>
-              <w:instrText xml:space="preserve"> PAGEREF _Toc230025474 \h </w:instrText>
+              <w:instrText xml:space="preserve"> PAGEREF _Toc230080765 \h </w:instrText>
             </w:r>
             <w:r>
               <w:rPr>
@@ -1882,7 +1891,7 @@
                 <w:webHidden/>
                 <w:sz w:val="24"/>
               </w:rPr>
-              <w:t>6</w:t>
+              <w:t>7</w:t>
             </w:r>
             <w:r>
               <w:rPr>
@@ -1895,13 +1904,269 @@
           </w:hyperlink>
         </w:p>
         <w:p>
+          <w:pPr>
+            <w:pStyle w:val="TDC2"/>
+            <w:tabs>
+              <w:tab w:val="right" w:pos="8828"/>
+            </w:tabs>
+            <w:rPr>
+              <w:rFonts w:eastAsiaTheme="minorEastAsia" w:cstheme="minorBidi"/>
+              <w:b w:val="0"/>
+              <w:bCs w:val="0"/>
+              <w:smallCaps w:val="0"/>
+              <w:noProof/>
+              <w:color w:val="auto"/>
+              <w:sz w:val="24"/>
+              <w:lang w:eastAsia="ja-JP"/>
+            </w:rPr>
+          </w:pPr>
+          <w:hyperlink w:anchor="_Toc230080766" w:history="1">
+            <w:r>
+              <w:rPr>
+                <w:rStyle w:val="Hipervnculo"/>
+                <w:noProof/>
+                <w:sz w:val="24"/>
+              </w:rPr>
+              <w:t>Observaciones (Equipo 2)</w:t>
+            </w:r>
+            <w:r>
+              <w:rPr>
+                <w:noProof/>
+                <w:webHidden/>
+                <w:sz w:val="24"/>
+              </w:rPr>
+              <w:tab/>
+            </w:r>
+            <w:r>
+              <w:rPr>
+                <w:noProof/>
+                <w:webHidden/>
+                <w:sz w:val="24"/>
+              </w:rPr>
+              <w:fldChar w:fldCharType="begin"/>
+            </w:r>
+            <w:r>
+              <w:rPr>
+                <w:noProof/>
+                <w:webHidden/>
+                <w:sz w:val="24"/>
+              </w:rPr>
+              <w:instrText xml:space="preserve"> PAGEREF _Toc230080766 \h </w:instrText>
+            </w:r>
+            <w:r>
+              <w:rPr>
+                <w:noProof/>
+                <w:webHidden/>
+                <w:sz w:val="24"/>
+              </w:rPr>
+            </w:r>
+            <w:r>
+              <w:rPr>
+                <w:noProof/>
+                <w:webHidden/>
+                <w:sz w:val="24"/>
+              </w:rPr>
+              <w:fldChar w:fldCharType="separate"/>
+            </w:r>
+            <w:r>
+              <w:rPr>
+                <w:noProof/>
+                <w:webHidden/>
+                <w:sz w:val="24"/>
+              </w:rPr>
+              <w:t>8</w:t>
+            </w:r>
+            <w:r>
+              <w:rPr>
+                <w:noProof/>
+                <w:webHidden/>
+                <w:sz w:val="24"/>
+              </w:rPr>
+              <w:fldChar w:fldCharType="end"/>
+            </w:r>
+          </w:hyperlink>
+        </w:p>
+        <w:p>
+          <w:pPr>
+            <w:pStyle w:val="TDC2"/>
+            <w:tabs>
+              <w:tab w:val="right" w:pos="8828"/>
+            </w:tabs>
+            <w:rPr>
+              <w:rFonts w:eastAsiaTheme="minorEastAsia" w:cstheme="minorBidi"/>
+              <w:b w:val="0"/>
+              <w:bCs w:val="0"/>
+              <w:smallCaps w:val="0"/>
+              <w:noProof/>
+              <w:color w:val="auto"/>
+              <w:sz w:val="24"/>
+              <w:lang w:eastAsia="ja-JP"/>
+            </w:rPr>
+          </w:pPr>
+          <w:hyperlink w:anchor="_Toc230080767" w:history="1">
+            <w:r>
+              <w:rPr>
+                <w:rStyle w:val="Hipervnculo"/>
+                <w:noProof/>
+                <w:sz w:val="24"/>
+              </w:rPr>
+              <w:t>Conclusión</w:t>
+            </w:r>
+            <w:r>
+              <w:rPr>
+                <w:noProof/>
+                <w:webHidden/>
+                <w:sz w:val="24"/>
+              </w:rPr>
+              <w:tab/>
+            </w:r>
+            <w:r>
+              <w:rPr>
+                <w:noProof/>
+                <w:webHidden/>
+                <w:sz w:val="24"/>
+              </w:rPr>
+              <w:fldChar w:fldCharType="begin"/>
+            </w:r>
+            <w:r>
+              <w:rPr>
+                <w:noProof/>
+                <w:webHidden/>
+                <w:sz w:val="24"/>
+              </w:rPr>
+              <w:instrText xml:space="preserve"> PAGEREF _Toc230080767 \h </w:instrText>
+            </w:r>
+            <w:r>
+              <w:rPr>
+                <w:noProof/>
+                <w:webHidden/>
+                <w:sz w:val="24"/>
+              </w:rPr>
+            </w:r>
+            <w:r>
+              <w:rPr>
+                <w:noProof/>
+                <w:webHidden/>
+                <w:sz w:val="24"/>
+              </w:rPr>
+              <w:fldChar w:fldCharType="separate"/>
+            </w:r>
+            <w:r>
+              <w:rPr>
+                <w:noProof/>
+                <w:webHidden/>
+                <w:sz w:val="24"/>
+              </w:rPr>
+              <w:t>9</w:t>
+            </w:r>
+            <w:r>
+              <w:rPr>
+                <w:noProof/>
+                <w:webHidden/>
+                <w:sz w:val="24"/>
+              </w:rPr>
+              <w:fldChar w:fldCharType="end"/>
+            </w:r>
+          </w:hyperlink>
+        </w:p>
+        <w:p>
+          <w:pPr>
+            <w:pStyle w:val="TDC2"/>
+            <w:tabs>
+              <w:tab w:val="right" w:pos="8828"/>
+            </w:tabs>
+            <w:rPr>
+              <w:rFonts w:eastAsiaTheme="minorEastAsia" w:cstheme="minorBidi"/>
+              <w:b w:val="0"/>
+              <w:bCs w:val="0"/>
+              <w:smallCaps w:val="0"/>
+              <w:noProof/>
+              <w:color w:val="auto"/>
+              <w:sz w:val="24"/>
+              <w:lang w:eastAsia="ja-JP"/>
+            </w:rPr>
+          </w:pPr>
+          <w:hyperlink w:anchor="_Toc230080768" w:history="1">
+            <w:r>
+              <w:rPr>
+                <w:rStyle w:val="Hipervnculo"/>
+                <w:noProof/>
+                <w:sz w:val="24"/>
+              </w:rPr>
+              <w:t>Trabajo Futuro</w:t>
+            </w:r>
+            <w:r>
+              <w:rPr>
+                <w:noProof/>
+                <w:webHidden/>
+                <w:sz w:val="24"/>
+              </w:rPr>
+              <w:tab/>
+            </w:r>
+            <w:r>
+              <w:rPr>
+                <w:noProof/>
+                <w:webHidden/>
+                <w:sz w:val="24"/>
+              </w:rPr>
+              <w:fldChar w:fldCharType="begin"/>
+            </w:r>
+            <w:r>
+              <w:rPr>
+                <w:noProof/>
+                <w:webHidden/>
+                <w:sz w:val="24"/>
+              </w:rPr>
+              <w:instrText xml:space="preserve"> PAGEREF _Toc230080768 \h </w:instrText>
+            </w:r>
+            <w:r>
+              <w:rPr>
+                <w:noProof/>
+                <w:webHidden/>
+                <w:sz w:val="24"/>
+              </w:rPr>
+            </w:r>
+            <w:r>
+              <w:rPr>
+                <w:noProof/>
+                <w:webHidden/>
+                <w:sz w:val="24"/>
+              </w:rPr>
+              <w:fldChar w:fldCharType="separate"/>
+            </w:r>
+            <w:r>
+              <w:rPr>
+                <w:noProof/>
+                <w:webHidden/>
+                <w:sz w:val="24"/>
+              </w:rPr>
+              <w:t>9</w:t>
+            </w:r>
+            <w:r>
+              <w:rPr>
+                <w:noProof/>
+                <w:webHidden/>
+                <w:sz w:val="24"/>
+              </w:rPr>
+              <w:fldChar w:fldCharType="end"/>
+            </w:r>
+          </w:hyperlink>
+        </w:p>
+        <w:p>
+          <w:pPr>
+            <w:rPr>
+              <w:b/>
+              <w:bCs/>
+              <w:lang w:val="es-ES"/>
+            </w:rPr>
+          </w:pPr>
           <w:r>
             <w:rPr>
               <w:rFonts w:asciiTheme="minorHAnsi" w:hAnsiTheme="minorHAnsi" w:cstheme="minorHAnsi"/>
               <w:b/>
               <w:bCs/>
               <w:caps/>
-              <w:sz w:val="44"/>
+              <w:sz w:val="52"/>
               <w:u w:val="single"/>
             </w:rPr>
             <w:fldChar w:fldCharType="end"/>
@@ -1912,10 +2177,9 @@
     <w:p>
       <w:pPr>
         <w:rPr>
-          <w:rFonts w:asciiTheme="majorHAnsi" w:eastAsia="Times New Roman" w:hAnsiTheme="majorHAnsi" w:cstheme="majorHAnsi"/>
           <w:b/>
-          <w:sz w:val="28"/>
-          <w:szCs w:val="24"/>
+          <w:bCs/>
+          <w:lang w:val="es-ES"/>
         </w:rPr>
       </w:pPr>
       <w:r>
@@ -1934,7 +2198,7 @@
         <w:spacing w:after="0"/>
         <w:ind w:left="0"/>
       </w:pPr>
-      <w:bookmarkStart w:id="0" w:name="_Toc230025458"/>
+      <w:bookmarkStart w:id="0" w:name="_Toc230080749"/>
       <w:r>
         <w:lastRenderedPageBreak/>
         <w:t>Análisis Comparativo de Detectores Faciales para Reconocimiento de Emociones en T</w:t>
@@ -1954,7 +2218,7 @@
       <w:pPr>
         <w:pStyle w:val="Ttulo2"/>
       </w:pPr>
-      <w:bookmarkStart w:id="1" w:name="_Toc230025459"/>
+      <w:bookmarkStart w:id="1" w:name="_Toc230080750"/>
       <w:r>
         <w:t>Introducción</w:t>
       </w:r>
@@ -1976,7 +2240,7 @@
       <w:pPr>
         <w:pStyle w:val="Ttulo2"/>
       </w:pPr>
-      <w:bookmarkStart w:id="2" w:name="_Toc230025460"/>
+      <w:bookmarkStart w:id="2" w:name="_Toc230080751"/>
       <w:r>
         <w:t>Objetivo</w:t>
       </w:r>
@@ -1986,7 +2250,7 @@
       <w:pPr>
         <w:pStyle w:val="Ttulo3"/>
       </w:pPr>
-      <w:bookmarkStart w:id="3" w:name="_Toc230025461"/>
+      <w:bookmarkStart w:id="3" w:name="_Toc230080752"/>
       <w:r>
         <w:t>Objetivo General</w:t>
       </w:r>
@@ -2002,7 +2266,7 @@
       <w:pPr>
         <w:pStyle w:val="Ttulo3"/>
       </w:pPr>
-      <w:bookmarkStart w:id="4" w:name="_Toc230025462"/>
+      <w:bookmarkStart w:id="4" w:name="_Toc230080753"/>
       <w:r>
         <w:t>Objetivos Específicos</w:t>
       </w:r>
@@ -2134,7 +2398,7 @@
       <w:pPr>
         <w:pStyle w:val="Ttulo2"/>
       </w:pPr>
-      <w:bookmarkStart w:id="5" w:name="_Toc230025463"/>
+      <w:bookmarkStart w:id="5" w:name="_Toc230080754"/>
       <w:r>
         <w:lastRenderedPageBreak/>
         <w:t>Tecnologías U</w:t>
@@ -2417,7 +2681,7 @@
       <w:pPr>
         <w:pStyle w:val="Ttulo2"/>
       </w:pPr>
-      <w:bookmarkStart w:id="6" w:name="_Toc230025464"/>
+      <w:bookmarkStart w:id="6" w:name="_Toc230080755"/>
       <w:r>
         <w:t>Detectores Faciales Evaluados</w:t>
       </w:r>
@@ -2427,7 +2691,7 @@
       <w:pPr>
         <w:pStyle w:val="Ttulo3"/>
       </w:pPr>
-      <w:bookmarkStart w:id="7" w:name="_Toc230025465"/>
+      <w:bookmarkStart w:id="7" w:name="_Toc230080756"/>
       <w:r>
         <w:t>OpenCV</w:t>
       </w:r>
@@ -2452,7 +2716,7 @@
       <w:pPr>
         <w:pStyle w:val="Ttulo3"/>
       </w:pPr>
-      <w:bookmarkStart w:id="8" w:name="_Toc230025466"/>
+      <w:bookmarkStart w:id="8" w:name="_Toc230080757"/>
       <w:r>
         <w:t>MTCNN</w:t>
       </w:r>
@@ -2477,7 +2741,7 @@
       <w:pPr>
         <w:pStyle w:val="Ttulo3"/>
       </w:pPr>
-      <w:bookmarkStart w:id="9" w:name="_Toc230025467"/>
+      <w:bookmarkStart w:id="9" w:name="_Toc230080758"/>
       <w:r>
         <w:t>RetinaFace</w:t>
       </w:r>
@@ -2502,7 +2766,7 @@
       <w:pPr>
         <w:pStyle w:val="Ttulo2"/>
       </w:pPr>
-      <w:bookmarkStart w:id="10" w:name="_Toc230025468"/>
+      <w:bookmarkStart w:id="10" w:name="_Toc230080759"/>
       <w:r>
         <w:t>Métricas Evaluadas</w:t>
       </w:r>
@@ -2627,7 +2891,7 @@
       <w:pPr>
         <w:pStyle w:val="Ttulo2"/>
       </w:pPr>
-      <w:bookmarkStart w:id="11" w:name="_Toc230025469"/>
+      <w:bookmarkStart w:id="11" w:name="_Toc230080760"/>
       <w:r>
         <w:lastRenderedPageBreak/>
         <w:t>Metodología</w:t>
@@ -2692,7 +2956,7 @@
       <w:pPr>
         <w:pStyle w:val="Ttulo2"/>
       </w:pPr>
-      <w:bookmarkStart w:id="12" w:name="_Toc230025470"/>
+      <w:bookmarkStart w:id="12" w:name="_Toc230080761"/>
       <w:r>
         <w:t>Hardware Utilizado Durante las Pruebas (Equipo 1)</w:t>
       </w:r>
@@ -2918,16 +3182,14 @@
       <w:pPr>
         <w:pStyle w:val="Ttulo2"/>
       </w:pPr>
-      <w:bookmarkStart w:id="13" w:name="_Toc230025471"/>
+      <w:bookmarkStart w:id="13" w:name="_Toc230080762"/>
       <w:r>
         <w:t>Resultados Obtenidos</w:t>
       </w:r>
       <w:r>
         <w:t xml:space="preserve"> (Equipo 1)</w:t>
       </w:r>
-      <w:bookmarkStart w:id="14" w:name="_GoBack"/>
       <w:bookmarkEnd w:id="13"/>
-      <w:bookmarkEnd w:id="14"/>
     </w:p>
     <w:tbl>
       <w:tblPr>
@@ -3468,7 +3730,6 @@
         <w:rPr>
           <w:rFonts w:asciiTheme="minorHAnsi" w:eastAsia="Times New Roman" w:hAnsiTheme="minorHAnsi" w:cstheme="minorHAnsi"/>
           <w:sz w:val="22"/>
-          <w:lang w:val="en-US"/>
         </w:rPr>
       </w:pPr>
       <w:r>
@@ -3483,12 +3744,15 @@
       <w:pPr>
         <w:pStyle w:val="Ttulo2"/>
       </w:pPr>
-      <w:bookmarkStart w:id="15" w:name="_Toc230025472"/>
+      <w:bookmarkStart w:id="14" w:name="_Toc230080763"/>
       <w:r>
         <w:lastRenderedPageBreak/>
         <w:t>Observaciones</w:t>
       </w:r>
-      <w:bookmarkEnd w:id="15"/>
+      <w:r>
+        <w:t xml:space="preserve"> (Equipo 1)</w:t>
+      </w:r>
+      <w:bookmarkEnd w:id="14"/>
     </w:p>
     <w:p>
       <w:r>
@@ -3518,11 +3782,879 @@
       <w:pPr>
         <w:pStyle w:val="Ttulo2"/>
       </w:pPr>
-      <w:bookmarkStart w:id="16" w:name="_Toc230025473"/>
+      <w:bookmarkStart w:id="15" w:name="_Toc230080764"/>
+      <w:r>
+        <w:t>Hardware Utilizado Durante las Pruebas (Equipo 2)</w:t>
+      </w:r>
+      <w:bookmarkEnd w:id="15"/>
+    </w:p>
+    <w:tbl>
+      <w:tblPr>
+        <w:tblStyle w:val="Tabladecuadrcula2"/>
+        <w:tblW w:w="0" w:type="auto"/>
+        <w:tblLook w:val="04A0" w:firstRow="1" w:lastRow="0" w:firstColumn="1" w:lastColumn="0" w:noHBand="0" w:noVBand="1"/>
+      </w:tblPr>
+      <w:tblGrid>
+        <w:gridCol w:w="2057"/>
+        <w:gridCol w:w="4565"/>
+      </w:tblGrid>
+      <w:tr>
+        <w:trPr>
+          <w:cnfStyle w:val="100000000000" w:firstRow="1" w:lastRow="0" w:firstColumn="0" w:lastColumn="0" w:oddVBand="0" w:evenVBand="0" w:oddHBand="0" w:evenHBand="0" w:firstRowFirstColumn="0" w:firstRowLastColumn="0" w:lastRowFirstColumn="0" w:lastRowLastColumn="0"/>
+        </w:trPr>
+        <w:tc>
+          <w:tcPr>
+            <w:cnfStyle w:val="001000000000" w:firstRow="0" w:lastRow="0" w:firstColumn="1" w:lastColumn="0" w:oddVBand="0" w:evenVBand="0" w:oddHBand="0" w:evenHBand="0" w:firstRowFirstColumn="0" w:firstRowLastColumn="0" w:lastRowFirstColumn="0" w:lastRowLastColumn="0"/>
+            <w:tcW w:w="0" w:type="auto"/>
+          </w:tcPr>
+          <w:p>
+            <w:pPr>
+              <w:spacing w:line="360" w:lineRule="auto"/>
+            </w:pPr>
+            <w:r>
+              <w:t>Componente</w:t>
+            </w:r>
+          </w:p>
+        </w:tc>
+        <w:tc>
+          <w:tcPr>
+            <w:tcW w:w="0" w:type="auto"/>
+          </w:tcPr>
+          <w:p>
+            <w:pPr>
+              <w:spacing w:line="360" w:lineRule="auto"/>
+              <w:cnfStyle w:val="100000000000" w:firstRow="1" w:lastRow="0" w:firstColumn="0" w:lastColumn="0" w:oddVBand="0" w:evenVBand="0" w:oddHBand="0" w:evenHBand="0" w:firstRowFirstColumn="0" w:firstRowLastColumn="0" w:lastRowFirstColumn="0" w:lastRowLastColumn="0"/>
+            </w:pPr>
+            <w:r>
+              <w:t>Especificación</w:t>
+            </w:r>
+          </w:p>
+        </w:tc>
+      </w:tr>
+      <w:tr>
+        <w:trPr>
+          <w:cnfStyle w:val="000000100000" w:firstRow="0" w:lastRow="0" w:firstColumn="0" w:lastColumn="0" w:oddVBand="0" w:evenVBand="0" w:oddHBand="1" w:evenHBand="0" w:firstRowFirstColumn="0" w:firstRowLastColumn="0" w:lastRowFirstColumn="0" w:lastRowLastColumn="0"/>
+        </w:trPr>
+        <w:tc>
+          <w:tcPr>
+            <w:cnfStyle w:val="001000000000" w:firstRow="0" w:lastRow="0" w:firstColumn="1" w:lastColumn="0" w:oddVBand="0" w:evenVBand="0" w:oddHBand="0" w:evenHBand="0" w:firstRowFirstColumn="0" w:firstRowLastColumn="0" w:lastRowFirstColumn="0" w:lastRowLastColumn="0"/>
+            <w:tcW w:w="0" w:type="auto"/>
+          </w:tcPr>
+          <w:p>
+            <w:pPr>
+              <w:spacing w:line="360" w:lineRule="auto"/>
+            </w:pPr>
+            <w:r>
+              <w:t>Equipo</w:t>
+            </w:r>
+          </w:p>
+        </w:tc>
+        <w:tc>
+          <w:tcPr>
+            <w:tcW w:w="0" w:type="auto"/>
+          </w:tcPr>
+          <w:p>
+            <w:pPr>
+              <w:spacing w:line="360" w:lineRule="auto"/>
+              <w:cnfStyle w:val="000000100000" w:firstRow="0" w:lastRow="0" w:firstColumn="0" w:lastColumn="0" w:oddVBand="0" w:evenVBand="0" w:oddHBand="1" w:evenHBand="0" w:firstRowFirstColumn="0" w:firstRowLastColumn="0" w:lastRowFirstColumn="0" w:lastRowLastColumn="0"/>
+            </w:pPr>
+            <w:r>
+              <w:t>Lenovo LOQ 15ARP9</w:t>
+            </w:r>
+          </w:p>
+        </w:tc>
+      </w:tr>
+      <w:tr>
+        <w:tc>
+          <w:tcPr>
+            <w:cnfStyle w:val="001000000000" w:firstRow="0" w:lastRow="0" w:firstColumn="1" w:lastColumn="0" w:oddVBand="0" w:evenVBand="0" w:oddHBand="0" w:evenHBand="0" w:firstRowFirstColumn="0" w:firstRowLastColumn="0" w:lastRowFirstColumn="0" w:lastRowLastColumn="0"/>
+            <w:tcW w:w="0" w:type="auto"/>
+          </w:tcPr>
+          <w:p>
+            <w:pPr>
+              <w:spacing w:line="360" w:lineRule="auto"/>
+            </w:pPr>
+            <w:r>
+              <w:t>Procesador</w:t>
+            </w:r>
+          </w:p>
+        </w:tc>
+        <w:tc>
+          <w:tcPr>
+            <w:tcW w:w="0" w:type="auto"/>
+          </w:tcPr>
+          <w:p>
+            <w:pPr>
+              <w:spacing w:line="360" w:lineRule="auto"/>
+              <w:cnfStyle w:val="000000000000" w:firstRow="0" w:lastRow="0" w:firstColumn="0" w:lastColumn="0" w:oddVBand="0" w:evenVBand="0" w:oddHBand="0" w:evenHBand="0" w:firstRowFirstColumn="0" w:firstRowLastColumn="0" w:lastRowFirstColumn="0" w:lastRowLastColumn="0"/>
+            </w:pPr>
+            <w:r>
+              <w:t>AMD Ryzen 7 7435HS</w:t>
+            </w:r>
+          </w:p>
+        </w:tc>
+      </w:tr>
+      <w:tr>
+        <w:trPr>
+          <w:cnfStyle w:val="000000100000" w:firstRow="0" w:lastRow="0" w:firstColumn="0" w:lastColumn="0" w:oddVBand="0" w:evenVBand="0" w:oddHBand="1" w:evenHBand="0" w:firstRowFirstColumn="0" w:firstRowLastColumn="0" w:lastRowFirstColumn="0" w:lastRowLastColumn="0"/>
+        </w:trPr>
+        <w:tc>
+          <w:tcPr>
+            <w:cnfStyle w:val="001000000000" w:firstRow="0" w:lastRow="0" w:firstColumn="1" w:lastColumn="0" w:oddVBand="0" w:evenVBand="0" w:oddHBand="0" w:evenHBand="0" w:firstRowFirstColumn="0" w:firstRowLastColumn="0" w:lastRowFirstColumn="0" w:lastRowLastColumn="0"/>
+            <w:tcW w:w="0" w:type="auto"/>
+          </w:tcPr>
+          <w:p>
+            <w:pPr>
+              <w:spacing w:line="360" w:lineRule="auto"/>
+            </w:pPr>
+            <w:r>
+              <w:t>RAM</w:t>
+            </w:r>
+          </w:p>
+        </w:tc>
+        <w:tc>
+          <w:tcPr>
+            <w:tcW w:w="0" w:type="auto"/>
+          </w:tcPr>
+          <w:p>
+            <w:pPr>
+              <w:spacing w:line="360" w:lineRule="auto"/>
+              <w:cnfStyle w:val="000000100000" w:firstRow="0" w:lastRow="0" w:firstColumn="0" w:lastColumn="0" w:oddVBand="0" w:evenVBand="0" w:oddHBand="1" w:evenHBand="0" w:firstRowFirstColumn="0" w:firstRowLastColumn="0" w:lastRowFirstColumn="0" w:lastRowLastColumn="0"/>
+            </w:pPr>
+            <w:r>
+              <w:t>16 GB DDR5 4800 MT/s</w:t>
+            </w:r>
+          </w:p>
+        </w:tc>
+      </w:tr>
+      <w:tr>
+        <w:tc>
+          <w:tcPr>
+            <w:cnfStyle w:val="001000000000" w:firstRow="0" w:lastRow="0" w:firstColumn="1" w:lastColumn="0" w:oddVBand="0" w:evenVBand="0" w:oddHBand="0" w:evenHBand="0" w:firstRowFirstColumn="0" w:firstRowLastColumn="0" w:lastRowFirstColumn="0" w:lastRowLastColumn="0"/>
+            <w:tcW w:w="0" w:type="auto"/>
+          </w:tcPr>
+          <w:p>
+            <w:pPr>
+              <w:spacing w:line="360" w:lineRule="auto"/>
+            </w:pPr>
+            <w:r>
+              <w:t>GPU</w:t>
+            </w:r>
+          </w:p>
+        </w:tc>
+        <w:tc>
+          <w:tcPr>
+            <w:tcW w:w="0" w:type="auto"/>
+          </w:tcPr>
+          <w:p>
+            <w:pPr>
+              <w:spacing w:line="360" w:lineRule="auto"/>
+              <w:cnfStyle w:val="000000000000" w:firstRow="0" w:lastRow="0" w:firstColumn="0" w:lastColumn="0" w:oddVBand="0" w:evenVBand="0" w:oddHBand="0" w:evenHBand="0" w:firstRowFirstColumn="0" w:firstRowLastColumn="0" w:lastRowFirstColumn="0" w:lastRowLastColumn="0"/>
+              <w:rPr>
+                <w:lang w:val="en-US"/>
+              </w:rPr>
+            </w:pPr>
+            <w:r>
+              <w:rPr>
+                <w:lang w:val="en-US"/>
+              </w:rPr>
+              <w:t xml:space="preserve">NVIDIA GeForce RTX 4050 Laptop GPU </w:t>
+            </w:r>
+            <w:r>
+              <w:rPr>
+                <w:lang w:val="en-US"/>
+              </w:rPr>
+              <w:t>(6GB)</w:t>
+            </w:r>
+          </w:p>
+        </w:tc>
+      </w:tr>
+      <w:tr>
+        <w:trPr>
+          <w:cnfStyle w:val="000000100000" w:firstRow="0" w:lastRow="0" w:firstColumn="0" w:lastColumn="0" w:oddVBand="0" w:evenVBand="0" w:oddHBand="1" w:evenHBand="0" w:firstRowFirstColumn="0" w:firstRowLastColumn="0" w:lastRowFirstColumn="0" w:lastRowLastColumn="0"/>
+        </w:trPr>
+        <w:tc>
+          <w:tcPr>
+            <w:cnfStyle w:val="001000000000" w:firstRow="0" w:lastRow="0" w:firstColumn="1" w:lastColumn="0" w:oddVBand="0" w:evenVBand="0" w:oddHBand="0" w:evenHBand="0" w:firstRowFirstColumn="0" w:firstRowLastColumn="0" w:lastRowFirstColumn="0" w:lastRowLastColumn="0"/>
+            <w:tcW w:w="0" w:type="auto"/>
+          </w:tcPr>
+          <w:p>
+            <w:pPr>
+              <w:spacing w:line="360" w:lineRule="auto"/>
+            </w:pPr>
+            <w:r>
+              <w:t>Sistema Operativo</w:t>
+            </w:r>
+          </w:p>
+        </w:tc>
+        <w:tc>
+          <w:tcPr>
+            <w:tcW w:w="0" w:type="auto"/>
+          </w:tcPr>
+          <w:p>
+            <w:pPr>
+              <w:spacing w:line="360" w:lineRule="auto"/>
+              <w:cnfStyle w:val="000000100000" w:firstRow="0" w:lastRow="0" w:firstColumn="0" w:lastColumn="0" w:oddVBand="0" w:evenVBand="0" w:oddHBand="1" w:evenHBand="0" w:firstRowFirstColumn="0" w:firstRowLastColumn="0" w:lastRowFirstColumn="0" w:lastRowLastColumn="0"/>
+            </w:pPr>
+            <w:r>
+              <w:t>Windows 11 64 bits</w:t>
+            </w:r>
+          </w:p>
+        </w:tc>
+      </w:tr>
+    </w:tbl>
+    <w:p/>
+    <w:p>
+      <w:pPr>
+        <w:pStyle w:val="Ttulo2"/>
+      </w:pPr>
+      <w:bookmarkStart w:id="16" w:name="_Toc230080765"/>
+      <w:r>
+        <w:t>Resultados Obtenidos (Equipo 2)</w:t>
+      </w:r>
+      <w:bookmarkEnd w:id="16"/>
+    </w:p>
+    <w:tbl>
+      <w:tblPr>
+        <w:tblStyle w:val="Tablanormal5"/>
+        <w:tblW w:w="0" w:type="auto"/>
+        <w:tblLook w:val="04A0" w:firstRow="1" w:lastRow="0" w:firstColumn="1" w:lastColumn="0" w:noHBand="0" w:noVBand="1"/>
+      </w:tblPr>
+      <w:tblGrid>
+        <w:gridCol w:w="1292"/>
+        <w:gridCol w:w="1456"/>
+        <w:gridCol w:w="1321"/>
+        <w:gridCol w:w="1480"/>
+        <w:gridCol w:w="3289"/>
+      </w:tblGrid>
+      <w:tr>
+        <w:trPr>
+          <w:cnfStyle w:val="100000000000" w:firstRow="1" w:lastRow="0" w:firstColumn="0" w:lastColumn="0" w:oddVBand="0" w:evenVBand="0" w:oddHBand="0" w:evenHBand="0" w:firstRowFirstColumn="0" w:firstRowLastColumn="0" w:lastRowFirstColumn="0" w:lastRowLastColumn="0"/>
+        </w:trPr>
+        <w:tc>
+          <w:tcPr>
+            <w:cnfStyle w:val="001000000100" w:firstRow="0" w:lastRow="0" w:firstColumn="1" w:lastColumn="0" w:oddVBand="0" w:evenVBand="0" w:oddHBand="0" w:evenHBand="0" w:firstRowFirstColumn="1" w:firstRowLastColumn="0" w:lastRowFirstColumn="0" w:lastRowLastColumn="0"/>
+            <w:tcW w:w="0" w:type="auto"/>
+          </w:tcPr>
+          <w:p>
+            <w:pPr>
+              <w:pStyle w:val="Prrafodelista"/>
+              <w:spacing w:line="360" w:lineRule="auto"/>
+              <w:ind w:left="0"/>
+              <w:rPr>
+                <w:rFonts w:asciiTheme="minorHAnsi" w:eastAsia="Times New Roman" w:hAnsiTheme="minorHAnsi" w:cstheme="minorHAnsi"/>
+                <w:b/>
+                <w:szCs w:val="24"/>
+              </w:rPr>
+            </w:pPr>
+            <w:r>
+              <w:rPr>
+                <w:rFonts w:asciiTheme="minorHAnsi" w:eastAsia="Times New Roman" w:hAnsiTheme="minorHAnsi" w:cstheme="minorHAnsi"/>
+                <w:b/>
+                <w:szCs w:val="24"/>
+              </w:rPr>
+              <w:t>Detector</w:t>
+            </w:r>
+          </w:p>
+        </w:tc>
+        <w:tc>
+          <w:tcPr>
+            <w:tcW w:w="0" w:type="auto"/>
+          </w:tcPr>
+          <w:p>
+            <w:pPr>
+              <w:pStyle w:val="Prrafodelista"/>
+              <w:spacing w:line="360" w:lineRule="auto"/>
+              <w:ind w:left="0"/>
+              <w:cnfStyle w:val="100000000000" w:firstRow="1" w:lastRow="0" w:firstColumn="0" w:lastColumn="0" w:oddVBand="0" w:evenVBand="0" w:oddHBand="0" w:evenHBand="0" w:firstRowFirstColumn="0" w:firstRowLastColumn="0" w:lastRowFirstColumn="0" w:lastRowLastColumn="0"/>
+              <w:rPr>
+                <w:rFonts w:asciiTheme="minorHAnsi" w:eastAsia="Times New Roman" w:hAnsiTheme="minorHAnsi" w:cstheme="minorHAnsi"/>
+                <w:b/>
+                <w:szCs w:val="24"/>
+              </w:rPr>
+            </w:pPr>
+            <w:r>
+              <w:rPr>
+                <w:rFonts w:asciiTheme="minorHAnsi" w:eastAsia="Times New Roman" w:hAnsiTheme="minorHAnsi" w:cstheme="minorHAnsi"/>
+                <w:b/>
+                <w:szCs w:val="24"/>
+              </w:rPr>
+              <w:t>Tiempo detección</w:t>
+            </w:r>
+          </w:p>
+        </w:tc>
+        <w:tc>
+          <w:tcPr>
+            <w:tcW w:w="0" w:type="auto"/>
+          </w:tcPr>
+          <w:p>
+            <w:pPr>
+              <w:pStyle w:val="Prrafodelista"/>
+              <w:spacing w:line="360" w:lineRule="auto"/>
+              <w:ind w:left="0"/>
+              <w:cnfStyle w:val="100000000000" w:firstRow="1" w:lastRow="0" w:firstColumn="0" w:lastColumn="0" w:oddVBand="0" w:evenVBand="0" w:oddHBand="0" w:evenHBand="0" w:firstRowFirstColumn="0" w:firstRowLastColumn="0" w:lastRowFirstColumn="0" w:lastRowLastColumn="0"/>
+              <w:rPr>
+                <w:rFonts w:asciiTheme="minorHAnsi" w:eastAsia="Times New Roman" w:hAnsiTheme="minorHAnsi" w:cstheme="minorHAnsi"/>
+                <w:b/>
+                <w:szCs w:val="24"/>
+              </w:rPr>
+            </w:pPr>
+            <w:r>
+              <w:rPr>
+                <w:rFonts w:asciiTheme="minorHAnsi" w:eastAsia="Times New Roman" w:hAnsiTheme="minorHAnsi" w:cstheme="minorHAnsi"/>
+                <w:b/>
+                <w:szCs w:val="24"/>
+              </w:rPr>
+              <w:t>FPS promedio</w:t>
+            </w:r>
+          </w:p>
+        </w:tc>
+        <w:tc>
+          <w:tcPr>
+            <w:tcW w:w="0" w:type="auto"/>
+          </w:tcPr>
+          <w:p>
+            <w:pPr>
+              <w:pStyle w:val="Prrafodelista"/>
+              <w:spacing w:line="360" w:lineRule="auto"/>
+              <w:ind w:left="0"/>
+              <w:cnfStyle w:val="100000000000" w:firstRow="1" w:lastRow="0" w:firstColumn="0" w:lastColumn="0" w:oddVBand="0" w:evenVBand="0" w:oddHBand="0" w:evenHBand="0" w:firstRowFirstColumn="0" w:firstRowLastColumn="0" w:lastRowFirstColumn="0" w:lastRowLastColumn="0"/>
+              <w:rPr>
+                <w:rFonts w:asciiTheme="minorHAnsi" w:eastAsia="Times New Roman" w:hAnsiTheme="minorHAnsi" w:cstheme="minorHAnsi"/>
+                <w:b/>
+                <w:szCs w:val="24"/>
+              </w:rPr>
+            </w:pPr>
+            <w:r>
+              <w:rPr>
+                <w:rFonts w:asciiTheme="minorHAnsi" w:eastAsia="Times New Roman" w:hAnsiTheme="minorHAnsi" w:cstheme="minorHAnsi"/>
+                <w:b/>
+                <w:szCs w:val="24"/>
+              </w:rPr>
+              <w:t xml:space="preserve">Precisión </w:t>
+            </w:r>
+            <w:r>
+              <w:rPr>
+                <w:rFonts w:asciiTheme="minorHAnsi" w:eastAsia="Times New Roman" w:hAnsiTheme="minorHAnsi" w:cstheme="minorHAnsi"/>
+                <w:b/>
+                <w:szCs w:val="24"/>
+              </w:rPr>
+              <w:t>percibida</w:t>
+            </w:r>
+          </w:p>
+        </w:tc>
+        <w:tc>
+          <w:tcPr>
+            <w:tcW w:w="0" w:type="auto"/>
+          </w:tcPr>
+          <w:p>
+            <w:pPr>
+              <w:pStyle w:val="Prrafodelista"/>
+              <w:spacing w:line="360" w:lineRule="auto"/>
+              <w:ind w:left="0"/>
+              <w:cnfStyle w:val="100000000000" w:firstRow="1" w:lastRow="0" w:firstColumn="0" w:lastColumn="0" w:oddVBand="0" w:evenVBand="0" w:oddHBand="0" w:evenHBand="0" w:firstRowFirstColumn="0" w:firstRowLastColumn="0" w:lastRowFirstColumn="0" w:lastRowLastColumn="0"/>
+              <w:rPr>
+                <w:rFonts w:asciiTheme="minorHAnsi" w:eastAsia="Times New Roman" w:hAnsiTheme="minorHAnsi" w:cstheme="minorHAnsi"/>
+                <w:b/>
+                <w:szCs w:val="24"/>
+              </w:rPr>
+            </w:pPr>
+            <w:r>
+              <w:rPr>
+                <w:rFonts w:asciiTheme="minorHAnsi" w:eastAsia="Times New Roman" w:hAnsiTheme="minorHAnsi" w:cstheme="minorHAnsi"/>
+                <w:b/>
+                <w:szCs w:val="24"/>
+              </w:rPr>
+              <w:t>Observaciones</w:t>
+            </w:r>
+          </w:p>
+        </w:tc>
+      </w:tr>
+      <w:tr>
+        <w:trPr>
+          <w:cnfStyle w:val="000000100000" w:firstRow="0" w:lastRow="0" w:firstColumn="0" w:lastColumn="0" w:oddVBand="0" w:evenVBand="0" w:oddHBand="1" w:evenHBand="0" w:firstRowFirstColumn="0" w:firstRowLastColumn="0" w:lastRowFirstColumn="0" w:lastRowLastColumn="0"/>
+        </w:trPr>
+        <w:tc>
+          <w:tcPr>
+            <w:cnfStyle w:val="001000000000" w:firstRow="0" w:lastRow="0" w:firstColumn="1" w:lastColumn="0" w:oddVBand="0" w:evenVBand="0" w:oddHBand="0" w:evenHBand="0" w:firstRowFirstColumn="0" w:firstRowLastColumn="0" w:lastRowFirstColumn="0" w:lastRowLastColumn="0"/>
+            <w:tcW w:w="0" w:type="auto"/>
+          </w:tcPr>
+          <w:p>
+            <w:pPr>
+              <w:pStyle w:val="Prrafodelista"/>
+              <w:spacing w:line="360" w:lineRule="auto"/>
+              <w:ind w:left="0"/>
+              <w:rPr>
+                <w:rFonts w:asciiTheme="minorHAnsi" w:eastAsia="Times New Roman" w:hAnsiTheme="minorHAnsi" w:cstheme="minorHAnsi"/>
+                <w:szCs w:val="24"/>
+              </w:rPr>
+            </w:pPr>
+            <w:r>
+              <w:rPr>
+                <w:rFonts w:asciiTheme="minorHAnsi" w:eastAsia="Times New Roman" w:hAnsiTheme="minorHAnsi" w:cstheme="minorHAnsi"/>
+                <w:szCs w:val="24"/>
+              </w:rPr>
+              <w:lastRenderedPageBreak/>
+              <w:t>OpenCV</w:t>
+            </w:r>
+          </w:p>
+        </w:tc>
+        <w:tc>
+          <w:tcPr>
+            <w:tcW w:w="0" w:type="auto"/>
+          </w:tcPr>
+          <w:p>
+            <w:pPr>
+              <w:pStyle w:val="Prrafodelista"/>
+              <w:spacing w:line="360" w:lineRule="auto"/>
+              <w:ind w:left="0"/>
+              <w:cnfStyle w:val="000000100000" w:firstRow="0" w:lastRow="0" w:firstColumn="0" w:lastColumn="0" w:oddVBand="0" w:evenVBand="0" w:oddHBand="1" w:evenHBand="0" w:firstRowFirstColumn="0" w:firstRowLastColumn="0" w:lastRowFirstColumn="0" w:lastRowLastColumn="0"/>
+              <w:rPr>
+                <w:rFonts w:asciiTheme="minorHAnsi" w:eastAsia="Times New Roman" w:hAnsiTheme="minorHAnsi" w:cstheme="minorHAnsi"/>
+                <w:szCs w:val="24"/>
+              </w:rPr>
+            </w:pPr>
+            <w:r>
+              <w:rPr>
+                <w:rFonts w:asciiTheme="minorHAnsi" w:eastAsia="Times New Roman" w:hAnsiTheme="minorHAnsi" w:cstheme="minorHAnsi"/>
+                <w:szCs w:val="24"/>
+              </w:rPr>
+              <w:t>0.04s-0.06s</w:t>
+            </w:r>
+          </w:p>
+        </w:tc>
+        <w:tc>
+          <w:tcPr>
+            <w:tcW w:w="0" w:type="auto"/>
+          </w:tcPr>
+          <w:p>
+            <w:pPr>
+              <w:pStyle w:val="Prrafodelista"/>
+              <w:spacing w:line="360" w:lineRule="auto"/>
+              <w:ind w:left="0"/>
+              <w:cnfStyle w:val="000000100000" w:firstRow="0" w:lastRow="0" w:firstColumn="0" w:lastColumn="0" w:oddVBand="0" w:evenVBand="0" w:oddHBand="1" w:evenHBand="0" w:firstRowFirstColumn="0" w:firstRowLastColumn="0" w:lastRowFirstColumn="0" w:lastRowLastColumn="0"/>
+              <w:rPr>
+                <w:rFonts w:asciiTheme="minorHAnsi" w:eastAsia="Times New Roman" w:hAnsiTheme="minorHAnsi" w:cstheme="minorHAnsi"/>
+                <w:szCs w:val="24"/>
+              </w:rPr>
+            </w:pPr>
+            <w:r>
+              <w:rPr>
+                <w:rFonts w:asciiTheme="minorHAnsi" w:eastAsia="Times New Roman" w:hAnsiTheme="minorHAnsi" w:cstheme="minorHAnsi"/>
+                <w:szCs w:val="24"/>
+              </w:rPr>
+              <w:t>18-27 FPS</w:t>
+            </w:r>
+          </w:p>
+        </w:tc>
+        <w:tc>
+          <w:tcPr>
+            <w:tcW w:w="0" w:type="auto"/>
+          </w:tcPr>
+          <w:p>
+            <w:pPr>
+              <w:pStyle w:val="Prrafodelista"/>
+              <w:spacing w:line="360" w:lineRule="auto"/>
+              <w:ind w:left="0"/>
+              <w:cnfStyle w:val="000000100000" w:firstRow="0" w:lastRow="0" w:firstColumn="0" w:lastColumn="0" w:oddVBand="0" w:evenVBand="0" w:oddHBand="1" w:evenHBand="0" w:firstRowFirstColumn="0" w:firstRowLastColumn="0" w:lastRowFirstColumn="0" w:lastRowLastColumn="0"/>
+              <w:rPr>
+                <w:rFonts w:asciiTheme="minorHAnsi" w:eastAsia="Times New Roman" w:hAnsiTheme="minorHAnsi" w:cstheme="minorHAnsi"/>
+                <w:szCs w:val="24"/>
+              </w:rPr>
+            </w:pPr>
+            <w:r>
+              <w:rPr>
+                <w:rFonts w:asciiTheme="minorHAnsi" w:eastAsia="Times New Roman" w:hAnsiTheme="minorHAnsi" w:cstheme="minorHAnsi"/>
+                <w:szCs w:val="24"/>
+              </w:rPr>
+              <w:t>Media</w:t>
+            </w:r>
+          </w:p>
+        </w:tc>
+        <w:tc>
+          <w:tcPr>
+            <w:tcW w:w="0" w:type="auto"/>
+          </w:tcPr>
+          <w:p>
+            <w:pPr>
+              <w:pStyle w:val="Prrafodelista"/>
+              <w:spacing w:line="360" w:lineRule="auto"/>
+              <w:ind w:left="0"/>
+              <w:cnfStyle w:val="000000100000" w:firstRow="0" w:lastRow="0" w:firstColumn="0" w:lastColumn="0" w:oddVBand="0" w:evenVBand="0" w:oddHBand="1" w:evenHBand="0" w:firstRowFirstColumn="0" w:firstRowLastColumn="0" w:lastRowFirstColumn="0" w:lastRowLastColumn="0"/>
+              <w:rPr>
+                <w:rFonts w:asciiTheme="minorHAnsi" w:eastAsia="Times New Roman" w:hAnsiTheme="minorHAnsi" w:cstheme="minorHAnsi"/>
+                <w:szCs w:val="24"/>
+              </w:rPr>
+            </w:pPr>
+            <w:r>
+              <w:rPr>
+                <w:rFonts w:asciiTheme="minorHAnsi" w:eastAsia="Times New Roman" w:hAnsiTheme="minorHAnsi" w:cstheme="minorHAnsi"/>
+                <w:szCs w:val="24"/>
+              </w:rPr>
+              <w:t>Fluido pero sufre falsos positivos, sobre todo con los anteojos</w:t>
+            </w:r>
+          </w:p>
+        </w:tc>
+      </w:tr>
+      <w:tr>
+        <w:tc>
+          <w:tcPr>
+            <w:cnfStyle w:val="001000000000" w:firstRow="0" w:lastRow="0" w:firstColumn="1" w:lastColumn="0" w:oddVBand="0" w:evenVBand="0" w:oddHBand="0" w:evenHBand="0" w:firstRowFirstColumn="0" w:firstRowLastColumn="0" w:lastRowFirstColumn="0" w:lastRowLastColumn="0"/>
+            <w:tcW w:w="0" w:type="auto"/>
+          </w:tcPr>
+          <w:p>
+            <w:pPr>
+              <w:pStyle w:val="Prrafodelista"/>
+              <w:spacing w:line="360" w:lineRule="auto"/>
+              <w:ind w:left="0"/>
+              <w:rPr>
+                <w:rFonts w:asciiTheme="minorHAnsi" w:eastAsia="Times New Roman" w:hAnsiTheme="minorHAnsi" w:cstheme="minorHAnsi"/>
+                <w:szCs w:val="24"/>
+              </w:rPr>
+            </w:pPr>
+            <w:r>
+              <w:rPr>
+                <w:rFonts w:asciiTheme="minorHAnsi" w:eastAsia="Times New Roman" w:hAnsiTheme="minorHAnsi" w:cstheme="minorHAnsi"/>
+                <w:szCs w:val="24"/>
+              </w:rPr>
+              <w:t>MTCNN</w:t>
+            </w:r>
+          </w:p>
+        </w:tc>
+        <w:tc>
+          <w:tcPr>
+            <w:tcW w:w="0" w:type="auto"/>
+          </w:tcPr>
+          <w:p>
+            <w:pPr>
+              <w:pStyle w:val="Prrafodelista"/>
+              <w:spacing w:line="360" w:lineRule="auto"/>
+              <w:ind w:left="0"/>
+              <w:cnfStyle w:val="000000000000" w:firstRow="0" w:lastRow="0" w:firstColumn="0" w:lastColumn="0" w:oddVBand="0" w:evenVBand="0" w:oddHBand="0" w:evenHBand="0" w:firstRowFirstColumn="0" w:firstRowLastColumn="0" w:lastRowFirstColumn="0" w:lastRowLastColumn="0"/>
+              <w:rPr>
+                <w:rFonts w:asciiTheme="minorHAnsi" w:eastAsia="Times New Roman" w:hAnsiTheme="minorHAnsi" w:cstheme="minorHAnsi"/>
+                <w:szCs w:val="24"/>
+              </w:rPr>
+            </w:pPr>
+            <w:r>
+              <w:rPr>
+                <w:rFonts w:asciiTheme="minorHAnsi" w:eastAsia="Times New Roman" w:hAnsiTheme="minorHAnsi" w:cstheme="minorHAnsi"/>
+                <w:szCs w:val="24"/>
+              </w:rPr>
+              <w:t>0.27s-0.41s</w:t>
+            </w:r>
+          </w:p>
+        </w:tc>
+        <w:tc>
+          <w:tcPr>
+            <w:tcW w:w="0" w:type="auto"/>
+          </w:tcPr>
+          <w:p>
+            <w:pPr>
+              <w:pStyle w:val="Prrafodelista"/>
+              <w:spacing w:line="360" w:lineRule="auto"/>
+              <w:ind w:left="0"/>
+              <w:cnfStyle w:val="000000000000" w:firstRow="0" w:lastRow="0" w:firstColumn="0" w:lastColumn="0" w:oddVBand="0" w:evenVBand="0" w:oddHBand="0" w:evenHBand="0" w:firstRowFirstColumn="0" w:firstRowLastColumn="0" w:lastRowFirstColumn="0" w:lastRowLastColumn="0"/>
+              <w:rPr>
+                <w:rFonts w:asciiTheme="minorHAnsi" w:eastAsia="Times New Roman" w:hAnsiTheme="minorHAnsi" w:cstheme="minorHAnsi"/>
+                <w:szCs w:val="24"/>
+              </w:rPr>
+            </w:pPr>
+            <w:r>
+              <w:rPr>
+                <w:rFonts w:asciiTheme="minorHAnsi" w:eastAsia="Times New Roman" w:hAnsiTheme="minorHAnsi" w:cstheme="minorHAnsi"/>
+                <w:szCs w:val="24"/>
+              </w:rPr>
+              <w:t>1-4 FPS</w:t>
+            </w:r>
+          </w:p>
+        </w:tc>
+        <w:tc>
+          <w:tcPr>
+            <w:tcW w:w="0" w:type="auto"/>
+          </w:tcPr>
+          <w:p>
+            <w:pPr>
+              <w:pStyle w:val="Prrafodelista"/>
+              <w:spacing w:line="360" w:lineRule="auto"/>
+              <w:ind w:left="0"/>
+              <w:cnfStyle w:val="000000000000" w:firstRow="0" w:lastRow="0" w:firstColumn="0" w:lastColumn="0" w:oddVBand="0" w:evenVBand="0" w:oddHBand="0" w:evenHBand="0" w:firstRowFirstColumn="0" w:firstRowLastColumn="0" w:lastRowFirstColumn="0" w:lastRowLastColumn="0"/>
+              <w:rPr>
+                <w:rFonts w:asciiTheme="minorHAnsi" w:eastAsia="Times New Roman" w:hAnsiTheme="minorHAnsi" w:cstheme="minorHAnsi"/>
+                <w:szCs w:val="24"/>
+              </w:rPr>
+            </w:pPr>
+            <w:r>
+              <w:rPr>
+                <w:rFonts w:asciiTheme="minorHAnsi" w:eastAsia="Times New Roman" w:hAnsiTheme="minorHAnsi" w:cstheme="minorHAnsi"/>
+                <w:szCs w:val="24"/>
+              </w:rPr>
+              <w:t>Buena</w:t>
+            </w:r>
+          </w:p>
+        </w:tc>
+        <w:tc>
+          <w:tcPr>
+            <w:tcW w:w="0" w:type="auto"/>
+          </w:tcPr>
+          <w:p>
+            <w:pPr>
+              <w:pStyle w:val="Prrafodelista"/>
+              <w:spacing w:line="360" w:lineRule="auto"/>
+              <w:ind w:left="0"/>
+              <w:cnfStyle w:val="000000000000" w:firstRow="0" w:lastRow="0" w:firstColumn="0" w:lastColumn="0" w:oddVBand="0" w:evenVBand="0" w:oddHBand="0" w:evenHBand="0" w:firstRowFirstColumn="0" w:firstRowLastColumn="0" w:lastRowFirstColumn="0" w:lastRowLastColumn="0"/>
+              <w:rPr>
+                <w:rFonts w:asciiTheme="minorHAnsi" w:eastAsia="Times New Roman" w:hAnsiTheme="minorHAnsi" w:cstheme="minorHAnsi"/>
+                <w:szCs w:val="24"/>
+              </w:rPr>
+            </w:pPr>
+            <w:r>
+              <w:rPr>
+                <w:rFonts w:asciiTheme="minorHAnsi" w:eastAsia="Times New Roman" w:hAnsiTheme="minorHAnsi" w:cstheme="minorHAnsi"/>
+                <w:szCs w:val="24"/>
+              </w:rPr>
+              <w:t>Muy lento para tiempo real</w:t>
+            </w:r>
+          </w:p>
+        </w:tc>
+      </w:tr>
+      <w:tr>
+        <w:trPr>
+          <w:cnfStyle w:val="000000100000" w:firstRow="0" w:lastRow="0" w:firstColumn="0" w:lastColumn="0" w:oddVBand="0" w:evenVBand="0" w:oddHBand="1" w:evenHBand="0" w:firstRowFirstColumn="0" w:firstRowLastColumn="0" w:lastRowFirstColumn="0" w:lastRowLastColumn="0"/>
+        </w:trPr>
+        <w:tc>
+          <w:tcPr>
+            <w:cnfStyle w:val="001000000000" w:firstRow="0" w:lastRow="0" w:firstColumn="1" w:lastColumn="0" w:oddVBand="0" w:evenVBand="0" w:oddHBand="0" w:evenHBand="0" w:firstRowFirstColumn="0" w:firstRowLastColumn="0" w:lastRowFirstColumn="0" w:lastRowLastColumn="0"/>
+            <w:tcW w:w="0" w:type="auto"/>
+          </w:tcPr>
+          <w:p>
+            <w:pPr>
+              <w:pStyle w:val="Prrafodelista"/>
+              <w:spacing w:line="360" w:lineRule="auto"/>
+              <w:ind w:left="0"/>
+              <w:rPr>
+                <w:rFonts w:asciiTheme="minorHAnsi" w:eastAsia="Times New Roman" w:hAnsiTheme="minorHAnsi" w:cstheme="minorHAnsi"/>
+                <w:szCs w:val="24"/>
+              </w:rPr>
+            </w:pPr>
+            <w:r>
+              <w:rPr>
+                <w:rFonts w:asciiTheme="minorHAnsi" w:eastAsia="Times New Roman" w:hAnsiTheme="minorHAnsi" w:cstheme="minorHAnsi"/>
+                <w:szCs w:val="24"/>
+              </w:rPr>
+              <w:t>RetinaFace</w:t>
+            </w:r>
+          </w:p>
+        </w:tc>
+        <w:tc>
+          <w:tcPr>
+            <w:tcW w:w="0" w:type="auto"/>
+          </w:tcPr>
+          <w:p>
+            <w:pPr>
+              <w:pStyle w:val="Prrafodelista"/>
+              <w:spacing w:line="360" w:lineRule="auto"/>
+              <w:ind w:left="0"/>
+              <w:cnfStyle w:val="000000100000" w:firstRow="0" w:lastRow="0" w:firstColumn="0" w:lastColumn="0" w:oddVBand="0" w:evenVBand="0" w:oddHBand="1" w:evenHBand="0" w:firstRowFirstColumn="0" w:firstRowLastColumn="0" w:lastRowFirstColumn="0" w:lastRowLastColumn="0"/>
+              <w:rPr>
+                <w:rFonts w:asciiTheme="minorHAnsi" w:eastAsia="Times New Roman" w:hAnsiTheme="minorHAnsi" w:cstheme="minorHAnsi"/>
+                <w:szCs w:val="24"/>
+              </w:rPr>
+            </w:pPr>
+            <w:r>
+              <w:rPr>
+                <w:rFonts w:asciiTheme="minorHAnsi" w:eastAsia="Times New Roman" w:hAnsiTheme="minorHAnsi" w:cstheme="minorHAnsi"/>
+                <w:szCs w:val="24"/>
+              </w:rPr>
+              <w:t>3.47s – 4.52s</w:t>
+            </w:r>
+          </w:p>
+        </w:tc>
+        <w:tc>
+          <w:tcPr>
+            <w:tcW w:w="0" w:type="auto"/>
+          </w:tcPr>
+          <w:p>
+            <w:pPr>
+              <w:pStyle w:val="Prrafodelista"/>
+              <w:spacing w:line="360" w:lineRule="auto"/>
+              <w:ind w:left="0"/>
+              <w:cnfStyle w:val="000000100000" w:firstRow="0" w:lastRow="0" w:firstColumn="0" w:lastColumn="0" w:oddVBand="0" w:evenVBand="0" w:oddHBand="1" w:evenHBand="0" w:firstRowFirstColumn="0" w:firstRowLastColumn="0" w:lastRowFirstColumn="0" w:lastRowLastColumn="0"/>
+              <w:rPr>
+                <w:rFonts w:asciiTheme="minorHAnsi" w:eastAsia="Times New Roman" w:hAnsiTheme="minorHAnsi" w:cstheme="minorHAnsi"/>
+                <w:szCs w:val="24"/>
+                <w:lang w:val="en-US"/>
+              </w:rPr>
+            </w:pPr>
+            <w:r>
+              <w:rPr>
+                <w:rFonts w:asciiTheme="minorHAnsi" w:eastAsia="Times New Roman" w:hAnsiTheme="minorHAnsi" w:cstheme="minorHAnsi"/>
+                <w:szCs w:val="24"/>
+                <w:lang w:val="en-US"/>
+              </w:rPr>
+              <w:t>&lt; 1 FPS</w:t>
+            </w:r>
+          </w:p>
+        </w:tc>
+        <w:tc>
+          <w:tcPr>
+            <w:tcW w:w="0" w:type="auto"/>
+          </w:tcPr>
+          <w:p>
+            <w:pPr>
+              <w:pStyle w:val="Prrafodelista"/>
+              <w:spacing w:line="360" w:lineRule="auto"/>
+              <w:ind w:left="0"/>
+              <w:cnfStyle w:val="000000100000" w:firstRow="0" w:lastRow="0" w:firstColumn="0" w:lastColumn="0" w:oddVBand="0" w:evenVBand="0" w:oddHBand="1" w:evenHBand="0" w:firstRowFirstColumn="0" w:firstRowLastColumn="0" w:lastRowFirstColumn="0" w:lastRowLastColumn="0"/>
+              <w:rPr>
+                <w:rFonts w:asciiTheme="minorHAnsi" w:eastAsia="Times New Roman" w:hAnsiTheme="minorHAnsi" w:cstheme="minorHAnsi"/>
+                <w:szCs w:val="24"/>
+              </w:rPr>
+            </w:pPr>
+            <w:r>
+              <w:rPr>
+                <w:rFonts w:asciiTheme="minorHAnsi" w:eastAsia="Times New Roman" w:hAnsiTheme="minorHAnsi" w:cstheme="minorHAnsi"/>
+                <w:szCs w:val="24"/>
+              </w:rPr>
+              <w:t>Alta</w:t>
+            </w:r>
+          </w:p>
+        </w:tc>
+        <w:tc>
+          <w:tcPr>
+            <w:tcW w:w="0" w:type="auto"/>
+          </w:tcPr>
+          <w:p>
+            <w:pPr>
+              <w:pStyle w:val="Prrafodelista"/>
+              <w:spacing w:line="360" w:lineRule="auto"/>
+              <w:ind w:left="0"/>
+              <w:cnfStyle w:val="000000100000" w:firstRow="0" w:lastRow="0" w:firstColumn="0" w:lastColumn="0" w:oddVBand="0" w:evenVBand="0" w:oddHBand="1" w:evenHBand="0" w:firstRowFirstColumn="0" w:firstRowLastColumn="0" w:lastRowFirstColumn="0" w:lastRowLastColumn="0"/>
+              <w:rPr>
+                <w:rFonts w:asciiTheme="minorHAnsi" w:eastAsia="Times New Roman" w:hAnsiTheme="minorHAnsi" w:cstheme="minorHAnsi"/>
+                <w:szCs w:val="24"/>
+              </w:rPr>
+            </w:pPr>
+            <w:r>
+              <w:rPr>
+                <w:rFonts w:asciiTheme="minorHAnsi" w:eastAsia="Times New Roman" w:hAnsiTheme="minorHAnsi" w:cstheme="minorHAnsi"/>
+                <w:szCs w:val="24"/>
+              </w:rPr>
+              <w:t>Precisión alta pero es demasiado lento</w:t>
+            </w:r>
+          </w:p>
+        </w:tc>
+      </w:tr>
+    </w:tbl>
+    <w:p>
+      <w:pPr>
+        <w:pStyle w:val="Prrafodelista"/>
+        <w:spacing w:before="240"/>
+        <w:ind w:left="0"/>
+        <w:rPr>
+          <w:rFonts w:asciiTheme="minorHAnsi" w:eastAsia="Times New Roman" w:hAnsiTheme="minorHAnsi" w:cstheme="minorHAnsi"/>
+          <w:sz w:val="22"/>
+        </w:rPr>
+      </w:pPr>
+      <w:r>
+        <w:rPr>
+          <w:rFonts w:asciiTheme="minorHAnsi" w:eastAsia="Times New Roman" w:hAnsiTheme="minorHAnsi" w:cstheme="minorHAnsi"/>
+          <w:sz w:val="22"/>
+        </w:rPr>
+        <w:t>Nota: Los valores registrados corresponden a promedios aproximados obtenidos durante pruebas en tiempo real bajo condiciones controladas.</w:t>
+      </w:r>
+    </w:p>
+    <w:p>
+      <w:pPr>
+        <w:pStyle w:val="Ttulo2"/>
+      </w:pPr>
+      <w:bookmarkStart w:id="17" w:name="_Toc230080766"/>
+      <w:r>
+        <w:t>Observaciones</w:t>
+      </w:r>
+      <w:r>
+        <w:t xml:space="preserve"> (Equipo 2)</w:t>
+      </w:r>
+      <w:bookmarkStart w:id="18" w:name="_GoBack"/>
+      <w:bookmarkEnd w:id="17"/>
+      <w:bookmarkEnd w:id="18"/>
+    </w:p>
+    <w:p>
+      <w:pPr>
+        <w:spacing w:after="160"/>
+      </w:pPr>
+      <w:r>
+        <w:tab/>
+      </w:r>
+      <w:r>
+        <w:t xml:space="preserve">Durante las pruebas realizadas se observó que OpenCV proporcionó el mejor desempeño para aplicaciones en tiempo real, manteniendo una experiencia fluida con una tasa de entre 18 y 27 FPS. Aunque OpenCV mostró buena velocidad de procesamiento, también presentó falsos positivos ocasionales, especialmente al detectar elementos como anteojos o regiones faciales parciales. </w:t>
+      </w:r>
+    </w:p>
+    <w:p>
+      <w:pPr>
+        <w:spacing w:after="160"/>
+      </w:pPr>
+      <w:r>
+        <w:tab/>
+      </w:r>
+      <w:r>
+        <w:t xml:space="preserve">MTCNN demostró una mejor precisión en la detección facial en comparación con OpenCV, logrando identificar rostros con mayor estabilidad; sin embargo, el tiempo de procesamiento fue considerablemente más alto, reduciendo la fluidez general del sistema. </w:t>
+      </w:r>
+    </w:p>
+    <w:p>
+      <w:pPr>
+        <w:spacing w:after="160"/>
+      </w:pPr>
+      <w:r>
+        <w:tab/>
+      </w:r>
+      <w:r>
+        <w:t xml:space="preserve">RetinaFace obtuvo la mayor precisión percibida entre los detectores evaluados, mostrando mejores resultados en condiciones complejas y con diferentes ángulos faciales. </w:t>
+      </w:r>
+    </w:p>
+    <w:p>
+      <w:pPr>
+        <w:spacing w:after="160"/>
+      </w:pPr>
+      <w:r>
+        <w:tab/>
+      </w:r>
+      <w:r>
+        <w:t xml:space="preserve">A pesar de su precisión, RetinaFace presentó tiempos de detección demasiado elevados para aplicaciones en tiempo real, alcanzando menos de 1 FPS durante las pruebas. </w:t>
+      </w:r>
+    </w:p>
+    <w:p>
+      <w:pPr>
+        <w:spacing w:after="160"/>
+      </w:pPr>
+      <w:r>
+        <w:lastRenderedPageBreak/>
+        <w:tab/>
+      </w:r>
+      <w:r>
+        <w:t xml:space="preserve">Se observó que los modelos más avanzados de detección facial demandan una mayor capacidad computacional, lo que impacta directamente en el rendimiento incluso utilizando un equipo con GPU dedicada como la NVIDIA GeForce RTX 4050. </w:t>
+      </w:r>
+    </w:p>
+    <w:p>
+      <w:pPr>
+        <w:spacing w:after="160"/>
+      </w:pPr>
+      <w:r>
+        <w:tab/>
+      </w:r>
+      <w:r>
+        <w:t xml:space="preserve">Durante las pruebas no se percibió una aceleración significativa por GPU en algunos detectores, por lo que gran parte del procesamiento pareció depender principalmente del CPU. </w:t>
+      </w:r>
+    </w:p>
+    <w:p>
+      <w:pPr>
+        <w:pStyle w:val="Ttulo2"/>
+      </w:pPr>
+      <w:bookmarkStart w:id="19" w:name="_Toc230080767"/>
       <w:r>
         <w:t>Conclusión</w:t>
       </w:r>
-      <w:bookmarkEnd w:id="16"/>
+      <w:bookmarkEnd w:id="19"/>
     </w:p>
     <w:p>
       <w:pPr>
@@ -3582,11 +4714,11 @@
       <w:pPr>
         <w:pStyle w:val="Ttulo2"/>
       </w:pPr>
-      <w:bookmarkStart w:id="17" w:name="_Toc230025474"/>
+      <w:bookmarkStart w:id="20" w:name="_Toc230080768"/>
       <w:r>
         <w:t>Trabajo Futuro</w:t>
       </w:r>
-      <w:bookmarkEnd w:id="17"/>
+      <w:bookmarkEnd w:id="20"/>
     </w:p>
     <w:p>
       <w:pPr>
@@ -3625,7 +4757,6 @@
           <w:rFonts w:asciiTheme="minorHAnsi" w:eastAsia="Times New Roman" w:hAnsiTheme="minorHAnsi" w:cstheme="minorHAnsi"/>
           <w:szCs w:val="24"/>
         </w:rPr>
-        <w:lastRenderedPageBreak/>
         <w:t>Interfaz gráfica para visualización de métricas.</w:t>
       </w:r>
     </w:p>
@@ -3706,6 +4837,7 @@
           <w:rFonts w:asciiTheme="minorHAnsi" w:eastAsia="Times New Roman" w:hAnsiTheme="minorHAnsi" w:cstheme="minorHAnsi"/>
           <w:szCs w:val="24"/>
         </w:rPr>
+        <w:lastRenderedPageBreak/>
         <w:t>Optimización del rendimiento.</w:t>
       </w:r>
     </w:p>
@@ -3801,6 +4933,7 @@
         <w:docPartUnique/>
       </w:docPartObj>
     </w:sdtPr>
+    <w:sdtEndPr/>
     <w:sdtContent>
       <w:p>
         <w:pPr>
@@ -3821,7 +4954,7 @@
             <w:noProof/>
             <w:lang w:val="es-ES"/>
           </w:rPr>
-          <w:t>2</w:t>
+          <w:t>10</w:t>
         </w:r>
         <w:r>
           <w:fldChar w:fldCharType="end"/>
@@ -7065,6 +8198,155 @@
     </w:lvl>
   </w:abstractNum>
   <w:abstractNum w:abstractNumId="33" w15:restartNumberingAfterBreak="0">
+    <w:nsid w:val="73030E18"/>
+    <w:multiLevelType w:val="multilevel"/>
+    <w:tmpl w:val="A98E21AC"/>
+    <w:lvl w:ilvl="0">
+      <w:start w:val="1"/>
+      <w:numFmt w:val="bullet"/>
+      <w:lvlText w:val=""/>
+      <w:lvlJc w:val="left"/>
+      <w:pPr>
+        <w:tabs>
+          <w:tab w:val="num" w:pos="720"/>
+        </w:tabs>
+        <w:ind w:left="720" w:hanging="360"/>
+      </w:pPr>
+      <w:rPr>
+        <w:rFonts w:ascii="Symbol" w:hAnsi="Symbol" w:hint="default"/>
+        <w:sz w:val="20"/>
+      </w:rPr>
+    </w:lvl>
+    <w:lvl w:ilvl="1" w:tentative="1">
+      <w:start w:val="1"/>
+      <w:numFmt w:val="bullet"/>
+      <w:lvlText w:val="o"/>
+      <w:lvlJc w:val="left"/>
+      <w:pPr>
+        <w:tabs>
+          <w:tab w:val="num" w:pos="1440"/>
+        </w:tabs>
+        <w:ind w:left="1440" w:hanging="360"/>
+      </w:pPr>
+      <w:rPr>
+        <w:rFonts w:ascii="Courier New" w:hAnsi="Courier New" w:hint="default"/>
+        <w:sz w:val="20"/>
+      </w:rPr>
+    </w:lvl>
+    <w:lvl w:ilvl="2" w:tentative="1">
+      <w:start w:val="1"/>
+      <w:numFmt w:val="bullet"/>
+      <w:lvlText w:val=""/>
+      <w:lvlJc w:val="left"/>
+      <w:pPr>
+        <w:tabs>
+          <w:tab w:val="num" w:pos="2160"/>
+        </w:tabs>
+        <w:ind w:left="2160" w:hanging="360"/>
+      </w:pPr>
+      <w:rPr>
+        <w:rFonts w:ascii="Wingdings" w:hAnsi="Wingdings" w:hint="default"/>
+        <w:sz w:val="20"/>
+      </w:rPr>
+    </w:lvl>
+    <w:lvl w:ilvl="3" w:tentative="1">
+      <w:start w:val="1"/>
+      <w:numFmt w:val="bullet"/>
+      <w:lvlText w:val=""/>
+      <w:lvlJc w:val="left"/>
+      <w:pPr>
+        <w:tabs>
+          <w:tab w:val="num" w:pos="2880"/>
+        </w:tabs>
+        <w:ind w:left="2880" w:hanging="360"/>
+      </w:pPr>
+      <w:rPr>
+        <w:rFonts w:ascii="Wingdings" w:hAnsi="Wingdings" w:hint="default"/>
+        <w:sz w:val="20"/>
+      </w:rPr>
+    </w:lvl>
+    <w:lvl w:ilvl="4" w:tentative="1">
+      <w:start w:val="1"/>
+      <w:numFmt w:val="bullet"/>
+      <w:lvlText w:val=""/>
+      <w:lvlJc w:val="left"/>
+      <w:pPr>
+        <w:tabs>
+          <w:tab w:val="num" w:pos="3600"/>
+        </w:tabs>
+        <w:ind w:left="3600" w:hanging="360"/>
+      </w:pPr>
+      <w:rPr>
+        <w:rFonts w:ascii="Wingdings" w:hAnsi="Wingdings" w:hint="default"/>
+        <w:sz w:val="20"/>
+      </w:rPr>
+    </w:lvl>
+    <w:lvl w:ilvl="5" w:tentative="1">
+      <w:start w:val="1"/>
+      <w:numFmt w:val="bullet"/>
+      <w:lvlText w:val=""/>
+      <w:lvlJc w:val="left"/>
+      <w:pPr>
+        <w:tabs>
+          <w:tab w:val="num" w:pos="4320"/>
+        </w:tabs>
+        <w:ind w:left="4320" w:hanging="360"/>
+      </w:pPr>
+      <w:rPr>
+        <w:rFonts w:ascii="Wingdings" w:hAnsi="Wingdings" w:hint="default"/>
+        <w:sz w:val="20"/>
+      </w:rPr>
+    </w:lvl>
+    <w:lvl w:ilvl="6" w:tentative="1">
+      <w:start w:val="1"/>
+      <w:numFmt w:val="bullet"/>
+      <w:lvlText w:val=""/>
+      <w:lvlJc w:val="left"/>
+      <w:pPr>
+        <w:tabs>
+          <w:tab w:val="num" w:pos="5040"/>
+        </w:tabs>
+        <w:ind w:left="5040" w:hanging="360"/>
+      </w:pPr>
+      <w:rPr>
+        <w:rFonts w:ascii="Wingdings" w:hAnsi="Wingdings" w:hint="default"/>
+        <w:sz w:val="20"/>
+      </w:rPr>
+    </w:lvl>
+    <w:lvl w:ilvl="7" w:tentative="1">
+      <w:start w:val="1"/>
+      <w:numFmt w:val="bullet"/>
+      <w:lvlText w:val=""/>
+      <w:lvlJc w:val="left"/>
+      <w:pPr>
+        <w:tabs>
+          <w:tab w:val="num" w:pos="5760"/>
+        </w:tabs>
+        <w:ind w:left="5760" w:hanging="360"/>
+      </w:pPr>
+      <w:rPr>
+        <w:rFonts w:ascii="Wingdings" w:hAnsi="Wingdings" w:hint="default"/>
+        <w:sz w:val="20"/>
+      </w:rPr>
+    </w:lvl>
+    <w:lvl w:ilvl="8" w:tentative="1">
+      <w:start w:val="1"/>
+      <w:numFmt w:val="bullet"/>
+      <w:lvlText w:val=""/>
+      <w:lvlJc w:val="left"/>
+      <w:pPr>
+        <w:tabs>
+          <w:tab w:val="num" w:pos="6480"/>
+        </w:tabs>
+        <w:ind w:left="6480" w:hanging="360"/>
+      </w:pPr>
+      <w:rPr>
+        <w:rFonts w:ascii="Wingdings" w:hAnsi="Wingdings" w:hint="default"/>
+        <w:sz w:val="20"/>
+      </w:rPr>
+    </w:lvl>
+  </w:abstractNum>
+  <w:abstractNum w:abstractNumId="34" w15:restartNumberingAfterBreak="0">
     <w:nsid w:val="7A376231"/>
     <w:multiLevelType w:val="hybridMultilevel"/>
     <w:tmpl w:val="4CB063B8"/>
@@ -7153,7 +8435,7 @@
       </w:pPr>
     </w:lvl>
   </w:abstractNum>
-  <w:abstractNum w:abstractNumId="34" w15:restartNumberingAfterBreak="0">
+  <w:abstractNum w:abstractNumId="35" w15:restartNumberingAfterBreak="0">
     <w:nsid w:val="7A8D5861"/>
     <w:multiLevelType w:val="hybridMultilevel"/>
     <w:tmpl w:val="77B00796"/>
@@ -7321,7 +8603,7 @@
     <w:abstractNumId w:val="1"/>
   </w:num>
   <w:num w:numId="19">
-    <w:abstractNumId w:val="34"/>
+    <w:abstractNumId w:val="35"/>
   </w:num>
   <w:num w:numId="20">
     <w:abstractNumId w:val="19"/>
@@ -7360,7 +8642,7 @@
     <w:abstractNumId w:val="8"/>
   </w:num>
   <w:num w:numId="32">
-    <w:abstractNumId w:val="33"/>
+    <w:abstractNumId w:val="34"/>
   </w:num>
   <w:num w:numId="33">
     <w:abstractNumId w:val="23"/>
@@ -7370,6 +8652,9 @@
   </w:num>
   <w:num w:numId="35">
     <w:abstractNumId w:val="26"/>
+  </w:num>
+  <w:num w:numId="36">
+    <w:abstractNumId w:val="33"/>
   </w:num>
   <w:numIdMacAtCleanup w:val="6"/>
 </w:numbering>
@@ -9620,7 +10905,7 @@
 </file>
 
 <file path=customXml/itemProps1.xml><?xml version="1.0" encoding="utf-8"?>
-<ds:datastoreItem xmlns:ds="http://schemas.openxmlformats.org/officeDocument/2006/customXml" ds:itemID="{C22FE8E1-685E-434E-9FF0-467176B0FE49}">
+<ds:datastoreItem xmlns:ds="http://schemas.openxmlformats.org/officeDocument/2006/customXml" ds:itemID="{34C6E41D-9AA2-4389-923B-0490B47B004C}">
   <ds:schemaRefs>
     <ds:schemaRef ds:uri="http://schemas.openxmlformats.org/officeDocument/2006/bibliography"/>
   </ds:schemaRefs>

</xml_diff>